<commit_message>
AGT-6 Removed unnecessary templates
I have also adjusted the `docx` template that should be used for creating additional templates _(with an adjusted number of questions)_
</commit_message>
<xml_diff>
--- a/templates/20/template_20.docx
+++ b/templates/20/template_20.docx
@@ -879,7 +879,7 @@
         <mc:AlternateContent>
           <mc:Choice Requires="wps">
             <w:drawing>
-              <wp:anchor distT="0" distB="0" distL="114300" distR="114300" simplePos="0" relativeHeight="251660288" behindDoc="0" locked="0" layoutInCell="1" allowOverlap="1" wp14:anchorId="442441F7" wp14:editId="251EBCEF">
+              <wp:anchor distT="0" distB="0" distL="114300" distR="114300" simplePos="0" relativeHeight="251660288" behindDoc="0" locked="0" layoutInCell="1" allowOverlap="1" wp14:anchorId="442441F7" wp14:editId="099A257D">
                 <wp:simplePos x="0" y="0"/>
                 <wp:positionH relativeFrom="column">
                   <wp:posOffset>-1375410</wp:posOffset>
@@ -904,7 +904,7 @@
                         <a:prstGeom prst="line">
                           <a:avLst/>
                         </a:prstGeom>
-                        <a:ln w="12700">
+                        <a:ln w="19050">
                           <a:solidFill>
                             <a:schemeClr val="tx1"/>
                           </a:solidFill>
@@ -936,7 +936,7 @@
           </mc:Choice>
           <mc:Fallback>
             <w:pict>
-              <v:line w14:anchorId="409EEEA9" id="Straight Connector 4" o:spid="_x0000_s1026" style="position:absolute;z-index:251660288;visibility:visible;mso-wrap-style:square;mso-width-percent:0;mso-wrap-distance-left:9pt;mso-wrap-distance-top:0;mso-wrap-distance-right:9pt;mso-wrap-distance-bottom:0;mso-position-horizontal:absolute;mso-position-horizontal-relative:text;mso-position-vertical:absolute;mso-position-vertical-relative:text;mso-width-percent:0;mso-width-relative:margin" from="-108.3pt,4.3pt" to="594pt,4.3pt" o:gfxdata="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" strokecolor="black [3213]" strokeweight="1pt">
+              <v:line w14:anchorId="2F72DED1" id="Straight Connector 4" o:spid="_x0000_s1026" style="position:absolute;z-index:251660288;visibility:visible;mso-wrap-style:square;mso-width-percent:0;mso-wrap-distance-left:9pt;mso-wrap-distance-top:0;mso-wrap-distance-right:9pt;mso-wrap-distance-bottom:0;mso-position-horizontal:absolute;mso-position-horizontal-relative:text;mso-position-vertical:absolute;mso-position-vertical-relative:text;mso-width-percent:0;mso-width-relative:margin" from="-108.3pt,4.3pt" to="594pt,4.3pt" o:gfxdata="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" strokecolor="black [3213]" strokeweight="1.5pt">
                 <v:stroke joinstyle="miter"/>
               </v:line>
             </w:pict>
@@ -1127,10 +1127,7 @@
                         <w:txbxContent>
                           <w:p>
                             <w:r>
-                              <w:t>F</w:t>
-                            </w:r>
-                            <w:r>
-                              <w:t>.</w:t>
+                              <w:t>F.</w:t>
                             </w:r>
                             <w:r>
                               <w:t xml:space="preserve"> </w:t>
@@ -1220,10 +1217,7 @@
                   <w:txbxContent>
                     <w:p>
                       <w:r>
-                        <w:t>F</w:t>
-                      </w:r>
-                      <w:r>
-                        <w:t>.</w:t>
+                        <w:t>F.</w:t>
                       </w:r>
                       <w:r>
                         <w:t xml:space="preserve"> </w:t>
@@ -1333,10 +1327,7 @@
                         <w:txbxContent>
                           <w:p>
                             <w:r>
-                              <w:t>E</w:t>
-                            </w:r>
-                            <w:r>
-                              <w:t>.</w:t>
+                              <w:t>E.</w:t>
                             </w:r>
                             <w:r>
                               <w:t xml:space="preserve"> </w:t>
@@ -1422,10 +1413,7 @@
                   <w:txbxContent>
                     <w:p>
                       <w:r>
-                        <w:t>E</w:t>
-                      </w:r>
-                      <w:r>
-                        <w:t>.</w:t>
+                        <w:t>E.</w:t>
                       </w:r>
                       <w:r>
                         <w:t xml:space="preserve"> </w:t>
@@ -1535,10 +1523,7 @@
                         <w:txbxContent>
                           <w:p>
                             <w:r>
-                              <w:t>D</w:t>
-                            </w:r>
-                            <w:r>
-                              <w:t>.</w:t>
+                              <w:t>D.</w:t>
                             </w:r>
                             <w:r>
                               <w:t xml:space="preserve"> </w:t>
@@ -1624,10 +1609,7 @@
                   <w:txbxContent>
                     <w:p>
                       <w:r>
-                        <w:t>D</w:t>
-                      </w:r>
-                      <w:r>
-                        <w:t>.</w:t>
+                        <w:t>D.</w:t>
                       </w:r>
                       <w:r>
                         <w:t xml:space="preserve"> </w:t>
@@ -1737,10 +1719,7 @@
                         <w:txbxContent>
                           <w:p>
                             <w:r>
-                              <w:t>B</w:t>
-                            </w:r>
-                            <w:r>
-                              <w:t>.</w:t>
+                              <w:t>B.</w:t>
                             </w:r>
                             <w:r>
                               <w:t xml:space="preserve"> </w:t>
@@ -1826,10 +1805,7 @@
                   <w:txbxContent>
                     <w:p>
                       <w:r>
-                        <w:t>B</w:t>
-                      </w:r>
-                      <w:r>
-                        <w:t>.</w:t>
+                        <w:t>B.</w:t>
                       </w:r>
                       <w:r>
                         <w:t xml:space="preserve"> </w:t>
@@ -1939,10 +1915,7 @@
                         <w:txbxContent>
                           <w:p>
                             <w:r>
-                              <w:t>C</w:t>
-                            </w:r>
-                            <w:r>
-                              <w:t>.</w:t>
+                              <w:t>C.</w:t>
                             </w:r>
                             <w:r>
                               <w:t xml:space="preserve"> </w:t>
@@ -2028,10 +2001,7 @@
                   <w:txbxContent>
                     <w:p>
                       <w:r>
-                        <w:t>C</w:t>
-                      </w:r>
-                      <w:r>
-                        <w:t>.</w:t>
+                        <w:t>C.</w:t>
                       </w:r>
                       <w:r>
                         <w:t xml:space="preserve"> </w:t>
@@ -2141,10 +2111,7 @@
                         <w:txbxContent>
                           <w:p>
                             <w:r>
-                              <w:t>A</w:t>
-                            </w:r>
-                            <w:r>
-                              <w:t>.</w:t>
+                              <w:t>A.</w:t>
                             </w:r>
                             <w:r>
                               <w:t xml:space="preserve"> </w:t>
@@ -2230,10 +2197,7 @@
                   <w:txbxContent>
                     <w:p>
                       <w:r>
-                        <w:t>A</w:t>
-                      </w:r>
-                      <w:r>
-                        <w:t>.</w:t>
+                        <w:t>A.</w:t>
                       </w:r>
                       <w:r>
                         <w:t xml:space="preserve"> </w:t>
@@ -3272,10 +3236,7 @@
                         <w:txbxContent>
                           <w:p>
                             <w:r>
-                              <w:t>2</w:t>
-                            </w:r>
-                            <w:r>
-                              <w:t>.</w:t>
+                              <w:t>2.</w:t>
                             </w:r>
                             <w:r>
                               <w:t xml:space="preserve"> </w:t>
@@ -3361,10 +3322,7 @@
                   <w:txbxContent>
                     <w:p>
                       <w:r>
-                        <w:t>2</w:t>
-                      </w:r>
-                      <w:r>
-                        <w:t>.</w:t>
+                        <w:t>2.</w:t>
                       </w:r>
                       <w:r>
                         <w:t xml:space="preserve"> </w:t>
@@ -4273,10 +4231,7 @@
                         <w:txbxContent>
                           <w:p>
                             <w:r>
-                              <w:t>3</w:t>
-                            </w:r>
-                            <w:r>
-                              <w:t>.</w:t>
+                              <w:t>3.</w:t>
                             </w:r>
                             <w:r>
                               <w:t xml:space="preserve"> </w:t>
@@ -4362,10 +4317,7 @@
                   <w:txbxContent>
                     <w:p>
                       <w:r>
-                        <w:t>3</w:t>
-                      </w:r>
-                      <w:r>
-                        <w:t>.</w:t>
+                        <w:t>3.</w:t>
                       </w:r>
                       <w:r>
                         <w:t xml:space="preserve"> </w:t>
@@ -4921,10 +4873,7 @@
                         <w:txbxContent>
                           <w:p>
                             <w:r>
-                              <w:t>4</w:t>
-                            </w:r>
-                            <w:r>
-                              <w:t>.</w:t>
+                              <w:t>4.</w:t>
                             </w:r>
                             <w:r>
                               <w:t xml:space="preserve"> </w:t>
@@ -5010,10 +4959,7 @@
                   <w:txbxContent>
                     <w:p>
                       <w:r>
-                        <w:t>4</w:t>
-                      </w:r>
-                      <w:r>
-                        <w:t>.</w:t>
+                        <w:t>4.</w:t>
                       </w:r>
                       <w:r>
                         <w:t xml:space="preserve"> </w:t>
@@ -5714,10 +5660,7 @@
                         <w:txbxContent>
                           <w:p>
                             <w:r>
-                              <w:t>5</w:t>
-                            </w:r>
-                            <w:r>
-                              <w:t>.</w:t>
+                              <w:t>5.</w:t>
                             </w:r>
                             <w:r>
                               <w:t xml:space="preserve"> </w:t>
@@ -5803,10 +5746,7 @@
                   <w:txbxContent>
                     <w:p>
                       <w:r>
-                        <w:t>5</w:t>
-                      </w:r>
-                      <w:r>
-                        <w:t>.</w:t>
+                        <w:t>5.</w:t>
                       </w:r>
                       <w:r>
                         <w:t xml:space="preserve"> </w:t>
@@ -6507,10 +6447,7 @@
                         <w:txbxContent>
                           <w:p>
                             <w:r>
-                              <w:t>6</w:t>
-                            </w:r>
-                            <w:r>
-                              <w:t>.</w:t>
+                              <w:t>6.</w:t>
                             </w:r>
                             <w:r>
                               <w:t xml:space="preserve"> </w:t>
@@ -6596,10 +6533,7 @@
                   <w:txbxContent>
                     <w:p>
                       <w:r>
-                        <w:t>6</w:t>
-                      </w:r>
-                      <w:r>
-                        <w:t>.</w:t>
+                        <w:t>6.</w:t>
                       </w:r>
                       <w:r>
                         <w:t xml:space="preserve"> </w:t>
@@ -7231,10 +7165,7 @@
                         <w:txbxContent>
                           <w:p>
                             <w:r>
-                              <w:t>7</w:t>
-                            </w:r>
-                            <w:r>
-                              <w:t>.</w:t>
+                              <w:t>7.</w:t>
                             </w:r>
                             <w:r>
                               <w:t xml:space="preserve"> </w:t>
@@ -7320,10 +7251,7 @@
                   <w:txbxContent>
                     <w:p>
                       <w:r>
-                        <w:t>7</w:t>
-                      </w:r>
-                      <w:r>
-                        <w:t>.</w:t>
+                        <w:t>7.</w:t>
                       </w:r>
                       <w:r>
                         <w:t xml:space="preserve"> </w:t>
@@ -8017,10 +7945,7 @@
                         <w:txbxContent>
                           <w:p>
                             <w:r>
-                              <w:t>8</w:t>
-                            </w:r>
-                            <w:r>
-                              <w:t>.</w:t>
+                              <w:t>8.</w:t>
                             </w:r>
                             <w:r>
                               <w:t xml:space="preserve"> </w:t>
@@ -8106,10 +8031,7 @@
                   <w:txbxContent>
                     <w:p>
                       <w:r>
-                        <w:t>8</w:t>
-                      </w:r>
-                      <w:r>
-                        <w:t>.</w:t>
+                        <w:t>8.</w:t>
                       </w:r>
                       <w:r>
                         <w:t xml:space="preserve"> </w:t>
@@ -8803,10 +8725,7 @@
                         <w:txbxContent>
                           <w:p>
                             <w:r>
-                              <w:t>9</w:t>
-                            </w:r>
-                            <w:r>
-                              <w:t>.</w:t>
+                              <w:t>9.</w:t>
                             </w:r>
                             <w:r>
                               <w:t xml:space="preserve"> </w:t>
@@ -8892,10 +8811,7 @@
                   <w:txbxContent>
                     <w:p>
                       <w:r>
-                        <w:t>9</w:t>
-                      </w:r>
-                      <w:r>
-                        <w:t>.</w:t>
+                        <w:t>9.</w:t>
                       </w:r>
                       <w:r>
                         <w:t xml:space="preserve"> </w:t>
@@ -9742,10 +9658,7 @@
                         <w:txbxContent>
                           <w:p>
                             <w:r>
-                              <w:t>10</w:t>
-                            </w:r>
-                            <w:r>
-                              <w:t>.</w:t>
+                              <w:t>10.</w:t>
                             </w:r>
                             <w:r>
                               <w:t xml:space="preserve"> </w:t>
@@ -9831,10 +9744,7 @@
                   <w:txbxContent>
                     <w:p>
                       <w:r>
-                        <w:t>10</w:t>
-                      </w:r>
-                      <w:r>
-                        <w:t>.</w:t>
+                        <w:t>10.</w:t>
                       </w:r>
                       <w:r>
                         <w:t xml:space="preserve"> </w:t>
@@ -10460,10 +10370,7 @@
                         <w:txbxContent>
                           <w:p>
                             <w:r>
-                              <w:t>11</w:t>
-                            </w:r>
-                            <w:r>
-                              <w:t>.</w:t>
+                              <w:t>11.</w:t>
                             </w:r>
                             <w:r>
                               <w:t xml:space="preserve"> </w:t>
@@ -10549,10 +10456,7 @@
                   <w:txbxContent>
                     <w:p>
                       <w:r>
-                        <w:t>11</w:t>
-                      </w:r>
-                      <w:r>
-                        <w:t>.</w:t>
+                        <w:t>11.</w:t>
                       </w:r>
                       <w:r>
                         <w:t xml:space="preserve"> </w:t>
@@ -11246,10 +11150,7 @@
                         <w:txbxContent>
                           <w:p>
                             <w:r>
-                              <w:t>1</w:t>
-                            </w:r>
-                            <w:r>
-                              <w:t>2.</w:t>
+                              <w:t>12.</w:t>
                             </w:r>
                             <w:r>
                               <w:t xml:space="preserve"> </w:t>
@@ -11335,10 +11236,7 @@
                   <w:txbxContent>
                     <w:p>
                       <w:r>
-                        <w:t>1</w:t>
-                      </w:r>
-                      <w:r>
-                        <w:t>2.</w:t>
+                        <w:t>12.</w:t>
                       </w:r>
                       <w:r>
                         <w:t xml:space="preserve"> </w:t>
@@ -11957,10 +11855,7 @@
                         <w:txbxContent>
                           <w:p>
                             <w:r>
-                              <w:t>13</w:t>
-                            </w:r>
-                            <w:r>
-                              <w:t>.</w:t>
+                              <w:t>13.</w:t>
                             </w:r>
                             <w:r>
                               <w:t xml:space="preserve"> </w:t>
@@ -12046,10 +11941,7 @@
                   <w:txbxContent>
                     <w:p>
                       <w:r>
-                        <w:t>13</w:t>
-                      </w:r>
-                      <w:r>
-                        <w:t>.</w:t>
+                        <w:t>13.</w:t>
                       </w:r>
                       <w:r>
                         <w:t xml:space="preserve"> </w:t>
@@ -12737,10 +12629,7 @@
                         <w:txbxContent>
                           <w:p>
                             <w:r>
-                              <w:t>14</w:t>
-                            </w:r>
-                            <w:r>
-                              <w:t>.</w:t>
+                              <w:t>14.</w:t>
                             </w:r>
                             <w:r>
                               <w:t xml:space="preserve"> </w:t>
@@ -12826,10 +12715,7 @@
                   <w:txbxContent>
                     <w:p>
                       <w:r>
-                        <w:t>14</w:t>
-                      </w:r>
-                      <w:r>
-                        <w:t>.</w:t>
+                        <w:t>14.</w:t>
                       </w:r>
                       <w:r>
                         <w:t xml:space="preserve"> </w:t>
@@ -13517,10 +13403,7 @@
                         <w:txbxContent>
                           <w:p>
                             <w:r>
-                              <w:t>15</w:t>
-                            </w:r>
-                            <w:r>
-                              <w:t>.</w:t>
+                              <w:t>15.</w:t>
                             </w:r>
                             <w:r>
                               <w:t xml:space="preserve"> </w:t>
@@ -13606,10 +13489,7 @@
                   <w:txbxContent>
                     <w:p>
                       <w:r>
-                        <w:t>15</w:t>
-                      </w:r>
-                      <w:r>
-                        <w:t>.</w:t>
+                        <w:t>15.</w:t>
                       </w:r>
                       <w:r>
                         <w:t xml:space="preserve"> </w:t>
@@ -14297,10 +14177,7 @@
                         <w:txbxContent>
                           <w:p>
                             <w:r>
-                              <w:t>16</w:t>
-                            </w:r>
-                            <w:r>
-                              <w:t>.</w:t>
+                              <w:t>16.</w:t>
                             </w:r>
                             <w:r>
                               <w:t xml:space="preserve"> </w:t>
@@ -14386,10 +14263,7 @@
                   <w:txbxContent>
                     <w:p>
                       <w:r>
-                        <w:t>16</w:t>
-                      </w:r>
-                      <w:r>
-                        <w:t>.</w:t>
+                        <w:t>16.</w:t>
                       </w:r>
                       <w:r>
                         <w:t xml:space="preserve"> </w:t>
@@ -15500,10 +15374,7 @@
                         <w:txbxContent>
                           <w:p>
                             <w:r>
-                              <w:t>17</w:t>
-                            </w:r>
-                            <w:r>
-                              <w:t>.</w:t>
+                              <w:t>17.</w:t>
                             </w:r>
                             <w:r>
                               <w:t xml:space="preserve"> </w:t>
@@ -15589,10 +15460,7 @@
                   <w:txbxContent>
                     <w:p>
                       <w:r>
-                        <w:t>17</w:t>
-                      </w:r>
-                      <w:r>
-                        <w:t>.</w:t>
+                        <w:t>17.</w:t>
                       </w:r>
                       <w:r>
                         <w:t xml:space="preserve"> </w:t>
@@ -16276,13 +16144,7 @@
                         <w:txbxContent>
                           <w:p>
                             <w:r>
-                              <w:t>2</w:t>
-                            </w:r>
-                            <w:r>
-                              <w:t>0</w:t>
-                            </w:r>
-                            <w:r>
-                              <w:t>.</w:t>
+                              <w:t>20.</w:t>
                             </w:r>
                             <w:r>
                               <w:t xml:space="preserve"> </w:t>
@@ -16368,13 +16230,7 @@
                   <w:txbxContent>
                     <w:p>
                       <w:r>
-                        <w:t>2</w:t>
-                      </w:r>
-                      <w:r>
-                        <w:t>0</w:t>
-                      </w:r>
-                      <w:r>
-                        <w:t>.</w:t>
+                        <w:t>20.</w:t>
                       </w:r>
                       <w:r>
                         <w:t xml:space="preserve"> </w:t>
@@ -16484,10 +16340,7 @@
                         <w:txbxContent>
                           <w:p>
                             <w:r>
-                              <w:t>19</w:t>
-                            </w:r>
-                            <w:r>
-                              <w:t>.</w:t>
+                              <w:t>19.</w:t>
                             </w:r>
                             <w:r>
                               <w:t xml:space="preserve"> </w:t>
@@ -16573,10 +16426,7 @@
                   <w:txbxContent>
                     <w:p>
                       <w:r>
-                        <w:t>19</w:t>
-                      </w:r>
-                      <w:r>
-                        <w:t>.</w:t>
+                        <w:t>19.</w:t>
                       </w:r>
                       <w:r>
                         <w:t xml:space="preserve"> </w:t>
@@ -16686,10 +16536,7 @@
                         <w:txbxContent>
                           <w:p>
                             <w:r>
-                              <w:t>18</w:t>
-                            </w:r>
-                            <w:r>
-                              <w:t>.</w:t>
+                              <w:t>18.</w:t>
                             </w:r>
                             <w:r>
                               <w:t xml:space="preserve"> </w:t>
@@ -16775,10 +16622,7 @@
                   <w:txbxContent>
                     <w:p>
                       <w:r>
-                        <w:t>18</w:t>
-                      </w:r>
-                      <w:r>
-                        <w:t>.</w:t>
+                        <w:t>18.</w:t>
                       </w:r>
                       <w:r>
                         <w:t xml:space="preserve"> </w:t>
@@ -19951,13 +19795,26 @@
       <w:jc w:val="right"/>
     </w:pPr>
     <w:r>
-      <w:t xml:space="preserve">    Name:</w:t>
+      <w:t xml:space="preserve">    </w:t>
+    </w:r>
+    <w:proofErr w:type="spellStart"/>
+    <w:proofErr w:type="gramStart"/>
+    <w:r>
+      <w:t>Name:</w:t>
     </w:r>
     <w:r>
       <w:rPr>
         <w:color w:val="FFFFFF" w:themeColor="background1"/>
       </w:rPr>
-      <w:t xml:space="preserve">sasasasasasaaaaaaaaaaaasalll </w:t>
+      <w:t>sasasasasasaaaaaaaaaaaasalll</w:t>
+    </w:r>
+    <w:proofErr w:type="spellEnd"/>
+    <w:proofErr w:type="gramEnd"/>
+    <w:r>
+      <w:rPr>
+        <w:color w:val="FFFFFF" w:themeColor="background1"/>
+      </w:rPr>
+      <w:t xml:space="preserve"> </w:t>
     </w:r>
     <w:r>
       <w:rPr>

</xml_diff>